<commit_message>
Fix kazanim features and remove credentials from tracking
- Fixed DataGrid to use correct API response structure
- Fixed "Yeni Ders Ekle" input field not accepting text
- Added filtering functionality for age groups and subjects
- Removed Google Cloud credentials from git tracking
- Added credentials to .gitignore for security

🤖 Generated with Claude Code (https://claude.ai/code)

Co-Authored-By: Claude <noreply@anthropic.com>
</commit_message>
<xml_diff>
--- a/backend/app/templates/sablon.docx
+++ b/backend/app/templates/sablon.docx
@@ -109,7 +109,7 @@
       <w:rPr>
         <w:noProof/>
       </w:rPr>
-      <w:pict w14:anchorId="11D2109C">
+      <w:pict w14:anchorId="00419945">
         <v:shapetype id="_x0000_t75" coordsize="21600,21600" o:spt="75" o:preferrelative="t" path="m@4@5l@4@11@9@11@9@5xe" filled="f" stroked="f">
           <v:stroke joinstyle="miter"/>
           <v:formulas>
@@ -129,9 +129,8 @@
           <v:path o:extrusionok="f" gradientshapeok="t" o:connecttype="rect"/>
           <o:lock v:ext="edit" aspectratio="t"/>
         </v:shapetype>
-        <v:shape id="WordPictureWatermark296690864" o:spid="_x0000_s1027" type="#_x0000_t75" alt="" style="position:absolute;margin-left:0;margin-top:0;width:599.6pt;height:846.3pt;z-index:-251639808;mso-wrap-edited:f;mso-width-percent:0;mso-height-percent:0;mso-position-horizontal:center;mso-position-horizontal-relative:margin;mso-position-vertical:center;mso-position-vertical-relative:margin;mso-width-percent:0;mso-height-percent:0" o:allowincell="f">
-          <v:imagedata r:id="rId1" o:title="Varlık 2@3x"/>
-          <w10:wrap anchorx="margin" anchory="margin"/>
+        <v:shape id="WordPictureWatermark28485420" o:spid="_x0000_s1027" type="#_x0000_t75" alt="" style="position:absolute;margin-left:0;margin-top:0;width:307.2pt;height:131.65pt;z-index:-251653120;mso-wrap-edited:f;mso-width-percent:0;mso-height-percent:0;mso-position-horizontal:center;mso-position-horizontal-relative:margin;mso-position-vertical:center;mso-position-vertical-relative:margin;mso-width-percent:0;mso-height-percent:0" o:allowincell="f">
+          <v:imagedata r:id="rId1" o:title="Katman 1"/>
         </v:shape>
       </w:pict>
     </w:r>
@@ -149,7 +148,7 @@
       <w:rPr>
         <w:noProof/>
       </w:rPr>
-      <w:pict w14:anchorId="4C647701">
+      <w:pict w14:anchorId="7452D317">
         <v:shapetype id="_x0000_t75" coordsize="21600,21600" o:spt="75" o:preferrelative="t" path="m@4@5l@4@11@9@11@9@5xe" filled="f" stroked="f">
           <v:stroke joinstyle="miter"/>
           <v:formulas>
@@ -169,9 +168,8 @@
           <v:path o:extrusionok="f" gradientshapeok="t" o:connecttype="rect"/>
           <o:lock v:ext="edit" aspectratio="t"/>
         </v:shapetype>
-        <v:shape id="WordPictureWatermark296690865" o:spid="_x0000_s1026" type="#_x0000_t75" alt="" style="position:absolute;margin-left:0;margin-top:0;width:599.6pt;height:846.3pt;z-index:-251637760;mso-wrap-edited:f;mso-width-percent:0;mso-height-percent:0;mso-position-horizontal:center;mso-position-horizontal-relative:margin;mso-position-vertical:center;mso-position-vertical-relative:margin;mso-width-percent:0;mso-height-percent:0" o:allowincell="f">
-          <v:imagedata r:id="rId1" o:title="Varlık 2@3x"/>
-          <w10:wrap anchorx="margin" anchory="margin"/>
+        <v:shape id="WordPictureWatermark28485421" o:spid="_x0000_s1026" type="#_x0000_t75" alt="" style="position:absolute;margin-left:0;margin-top:0;width:307.2pt;height:131.65pt;z-index:-251650048;mso-wrap-edited:f;mso-width-percent:0;mso-height-percent:0;mso-position-horizontal:center;mso-position-horizontal-relative:margin;mso-position-vertical:center;mso-position-vertical-relative:margin;mso-width-percent:0;mso-height-percent:0" o:allowincell="f">
+          <v:imagedata r:id="rId1" o:title="Katman 1"/>
         </v:shape>
       </w:pict>
     </w:r>
@@ -189,7 +187,7 @@
       <w:rPr>
         <w:noProof/>
       </w:rPr>
-      <w:pict w14:anchorId="1E0DBCAF">
+      <w:pict w14:anchorId="45270E56">
         <v:shapetype id="_x0000_t75" coordsize="21600,21600" o:spt="75" o:preferrelative="t" path="m@4@5l@4@11@9@11@9@5xe" filled="f" stroked="f">
           <v:stroke joinstyle="miter"/>
           <v:formulas>
@@ -209,9 +207,8 @@
           <v:path o:extrusionok="f" gradientshapeok="t" o:connecttype="rect"/>
           <o:lock v:ext="edit" aspectratio="t"/>
         </v:shapetype>
-        <v:shape id="WordPictureWatermark296690863" o:spid="_x0000_s1025" type="#_x0000_t75" alt="" style="position:absolute;margin-left:0;margin-top:0;width:599.6pt;height:846.3pt;z-index:-251641856;mso-wrap-edited:f;mso-width-percent:0;mso-height-percent:0;mso-position-horizontal:center;mso-position-horizontal-relative:margin;mso-position-vertical:center;mso-position-vertical-relative:margin;mso-width-percent:0;mso-height-percent:0" o:allowincell="f">
-          <v:imagedata r:id="rId1" o:title="Varlık 2@3x"/>
-          <w10:wrap anchorx="margin" anchory="margin"/>
+        <v:shape id="WordPictureWatermark28485419" o:spid="_x0000_s1025" type="#_x0000_t75" alt="" style="position:absolute;margin-left:0;margin-top:0;width:307.2pt;height:131.65pt;z-index:-251656192;mso-wrap-edited:f;mso-width-percent:0;mso-height-percent:0;mso-position-horizontal:center;mso-position-horizontal-relative:margin;mso-position-vertical:center;mso-position-vertical-relative:margin;mso-width-percent:0;mso-height-percent:0" o:allowincell="f">
+          <v:imagedata r:id="rId1" o:title="Katman 1"/>
         </v:shape>
       </w:pict>
     </w:r>

</xml_diff>